<commit_message>
docs: add Future Use Cases section to SETUP.md; fully rewrite JevNowIntegration.docx to match current state
</commit_message>
<xml_diff>
--- a/docs/JevNowIntegration.docx
+++ b/docs/JevNowIntegration.docx
@@ -18,6 +18,7 @@
     </w:p>
     <w:p>
       <w:pPr>
+        <w:pStyle w:val="Subtitle"/>
         <w:spacing w:after="80"/>
         <w:jc w:val="center"/>
       </w:pPr>
@@ -38,7 +39,7 @@
           <w:color w:val="57606A"/>
           <w:sz w:val="20"/>
         </w:rPr>
-        <w:t xml:space="preserve">GitHub: https://github.com/anilvaranasi/jev-sn-app  |  Scoped App: x_146833_jevnowint  |  SDK: @servicenow/sdk 4.13.0</w:t>
+        <w:t xml:space="preserve">GitHub: https://github.com/anilvaranasi/jev-sn-app  |  Scoped App: x_146833_jevnowint  |  SDK: @servicenow/sdk 4.13.0  |  Model: jev-1.13-free</w:t>
       </w:r>
     </w:p>
     <w:p>
@@ -62,7 +63,7 @@
         <w:rPr>
           <w:sz w:val="22"/>
         </w:rPr>
-        <w:t xml:space="preserve">JevNowIntegration is a ServiceNow scoped application that integrates the BeatAPI Jev AI decisions engine into ServiceNow workflows. It allows any ServiceNow flow or script to submit structured AI judgment questions against a state description and receive typed answers — noul probabilities, choice selections, or scored levels — without leaving the ServiceNow platform.</w:t>
+        <w:t xml:space="preserve">JevNowIntegration is a ServiceNow scoped application that embeds the TypeSafe Jev AI decisions engine into ServiceNow workflows. Given any source record (e.g. an incident), it submits structured AI judgment questions and writes typed answers back enabling automated triage, prioritisation, and routing without hardcoded rules.</w:t>
       </w:r>
     </w:p>
     <w:p>
@@ -73,7 +74,7 @@
         <w:rPr>
           <w:sz w:val="22"/>
         </w:rPr>
-        <w:t xml:space="preserve">The integration was validated end-to-end: a test flow TriggerJevIntegration triggered on a Jev Request record, built the request payload from the record fields, called the InvokeJevRESTAPI action, and received structured answers back in 4366ms.</w:t>
+        <w:t xml:space="preserve">The integration is config-driven: adding Jev evaluation to a new ServiceNow table requires only inserting rows into the Jev Field Map table with no code changes to flows or script includes.</w:t>
       </w:r>
     </w:p>
     <w:p>
@@ -97,7 +98,7 @@
         <w:rPr>
           <w:sz w:val="22"/>
         </w:rPr>
-        <w:t xml:space="preserve">The solution follows a SN-first development model. Artefacts are built in ServiceNow Flow Designer and Studio, then pulled back to GitHub via the now-sdk transform command. Deployments are fully automated via GitHub Actions.</w:t>
+        <w:t xml:space="preserve">The solution follows a SN-first development model. Artefacts are built in ServiceNow Flow Designer and Studio, pulled back to GitHub via now-sdk transform, and deployed via GitHub Actions.</w:t>
       </w:r>
     </w:p>
     <w:p>
@@ -117,7 +118,7 @@
       <w:pPr>
         <w:numPr>
           <w:ilvl w:val="0"/>
-          <w:numId w:val="1"/>
+          <w:numId w:val="2"/>
         </w:numPr>
         <w:spacing w:after="80"/>
       </w:pPr>
@@ -125,14 +126,14 @@
         <w:rPr>
           <w:sz w:val="22"/>
         </w:rPr>
-        <w:t xml:space="preserve">mydev — Working branch. All SN pulls and code changes land here.</w:t>
+        <w:t xml:space="preserve">mydev: Working branch. All SN pulls and code changes land here.</w:t>
       </w:r>
     </w:p>
     <w:p>
       <w:pPr>
         <w:numPr>
           <w:ilvl w:val="0"/>
-          <w:numId w:val="1"/>
+          <w:numId w:val="2"/>
         </w:numPr>
         <w:spacing w:after="80"/>
       </w:pPr>
@@ -140,14 +141,14 @@
         <w:rPr>
           <w:sz w:val="22"/>
         </w:rPr>
-        <w:t xml:space="preserve">nowdev — Deploy gate for DEV. Only receives merges from mydev. Triggers deploy to SN DEV on push.</w:t>
+        <w:t xml:space="preserve">nowdev: Deploy gate for DEV. Triggers deploy to SN DEV on push.</w:t>
       </w:r>
     </w:p>
     <w:p>
       <w:pPr>
         <w:numPr>
           <w:ilvl w:val="0"/>
-          <w:numId w:val="1"/>
+          <w:numId w:val="2"/>
         </w:numPr>
         <w:spacing w:after="240"/>
       </w:pPr>
@@ -155,40 +156,49 @@
         <w:rPr>
           <w:sz w:val="22"/>
         </w:rPr>
-        <w:t xml:space="preserve">prod — Deploy gate for PROD. Only receives merges from nowdev. Triggers deploy to SN PROD on push.</w:t>
-      </w:r>
-    </w:p>
-    <w:p>
-      <w:pPr>
+        <w:t xml:space="preserve">prod: Deploy gate for PROD. Triggers deploy to SN PROD on push.</w:t>
+      </w:r>
+    </w:p>
+    <w:p>
+      <w:pPr>
+        <w:pStyle w:val="Heading2"/>
         <w:spacing w:after="80"/>
       </w:pPr>
       <w:r>
         <w:rPr>
           <w:sz w:val="20"/>
         </w:rPr>
-        <w:t xml:space="preserve">Developer (Bob/local)  →  git push  →  mydev  ←  pull-from-sn.yml (GitHub Action, manual trigger)</w:t>
-      </w:r>
-    </w:p>
-    <w:p>
-      <w:pPr>
+        <w:t xml:space="preserve">GitHub Actions</w:t>
+      </w:r>
+    </w:p>
+    <w:p>
+      <w:pPr>
+        <w:numPr>
+          <w:ilvl w:val="0"/>
+          <w:numId w:val="3"/>
+        </w:numPr>
         <w:spacing w:after="80"/>
       </w:pPr>
       <w:r>
         <w:rPr>
           <w:sz w:val="20"/>
         </w:rPr>
-        <w:t xml:space="preserve">mydev  →  PR merge  →  nowdev  →  deploy.yml  →  ServiceNow DEV</w:t>
-      </w:r>
-    </w:p>
-    <w:p>
-      <w:pPr>
+        <w:t xml:space="preserve">deploy.yml: Auto-deploys to SN DEV or PROD on push to nowdev or prod branches.</w:t>
+      </w:r>
+    </w:p>
+    <w:p>
+      <w:pPr>
+        <w:numPr>
+          <w:ilvl w:val="0"/>
+          <w:numId w:val="3"/>
+        </w:numPr>
         <w:spacing w:after="320"/>
       </w:pPr>
       <w:r>
         <w:rPr>
           <w:sz w:val="20"/>
         </w:rPr>
-        <w:t xml:space="preserve">nowdev  →  PR merge  →  prod  →  deploy.yml  →  ServiceNow PROD</w:t>
+        <w:t xml:space="preserve">pull-from-sn.yml: Manual workflow_dispatch. Runs now-sdk transform against SN DEV and commits Fluent source back to mydev.</w:t>
       </w:r>
     </w:p>
     <w:p>
@@ -201,7 +211,7 @@
           <w:b/>
           <w:sz w:val="36"/>
         </w:rPr>
-        <w:t xml:space="preserve">3. Components</w:t>
+        <w:t xml:space="preserve">3. End-to-End Flow</w:t>
       </w:r>
     </w:p>
     <w:tbl>
@@ -225,6 +235,1006 @@
         </w:tc>
       </w:tr>
     </w:tbl>
+    <w:p>
+      <w:pPr/>
+      <w:r>
+        <w:rPr/>
+        <w:t xml:space="preserve">A source record (e.g. incident) triggers creation of a x_146833_jevnowint_request record. The before-insert Business Rule auto-populates u_questions and u_state_text from the field map config. The TriggerJevIntegration flow fires on u_state=pending, calls the InvokeJevRESTAPI action, and writes answers back. A second BR then builds a clean u_result_summary JSON map.</w:t>
+      </w:r>
+    </w:p>
+    <w:p>
+      <w:pPr>
+        <w:pStyle w:val="Heading1"/>
+      </w:pPr>
+      <w:r>
+        <w:rPr/>
+        <w:t xml:space="preserve">4. Tables</w:t>
+      </w:r>
+    </w:p>
+    <w:p>
+      <w:pPr>
+        <w:pStyle w:val="Heading2"/>
+      </w:pPr>
+      <w:r>
+        <w:rPr/>
+        <w:t xml:space="preserve">4.1 x_146833_jevnowint_request (Jev Request)</w:t>
+      </w:r>
+    </w:p>
+    <w:tbl>
+      <w:tblPr>
+        <w:tblW w:w="5000" w:type="pct"/>
+        <w:tblBorders>
+          <w:top w:val="single" w:sz="4"/>
+          <w:left w:val="single" w:sz="4"/>
+          <w:bottom w:val="single" w:sz="4"/>
+          <w:right w:val="single" w:sz="4"/>
+          <w:insideH w:val="single" w:sz="4"/>
+          <w:insideV w:val="single" w:sz="4"/>
+        </w:tblBorders>
+      </w:tblPr>
+      <w:tblGrid>
+        <w:gridCol w:w="2768"/>
+        <w:gridCol w:w="2768"/>
+        <w:gridCol w:w="2768"/>
+      </w:tblGrid>
+      <w:tr>
+        <w:trPr>
+          <w:tblHeader/>
+        </w:trPr>
+        <w:tc>
+          <w:p>
+            <w:r>
+              <w:t xml:space="preserve">Column</w:t>
+            </w:r>
+          </w:p>
+        </w:tc>
+        <w:tc>
+          <w:p>
+            <w:r>
+              <w:t xml:space="preserve">Type</w:t>
+            </w:r>
+          </w:p>
+        </w:tc>
+        <w:tc>
+          <w:p>
+            <w:r>
+              <w:t xml:space="preserve">Purpose</w:t>
+            </w:r>
+          </w:p>
+        </w:tc>
+      </w:tr>
+      <w:tr>
+        <w:trPr/>
+        <w:tc>
+          <w:p>
+            <w:r>
+              <w:t xml:space="preserve">u_state</w:t>
+            </w:r>
+          </w:p>
+        </w:tc>
+        <w:tc>
+          <w:p>
+            <w:r>
+              <w:t xml:space="preserve">Choice</w:t>
+            </w:r>
+          </w:p>
+        </w:tc>
+        <w:tc>
+          <w:p>
+            <w:r>
+              <w:t xml:space="preserve">pending / processing / processed / failed</w:t>
+            </w:r>
+          </w:p>
+        </w:tc>
+      </w:tr>
+      <w:tr>
+        <w:trPr/>
+        <w:tc>
+          <w:p>
+            <w:r>
+              <w:t xml:space="preserve">u_state_text</w:t>
+            </w:r>
+          </w:p>
+        </w:tc>
+        <w:tc>
+          <w:p>
+            <w:r>
+              <w:t xml:space="preserve">String(4000)</w:t>
+            </w:r>
+          </w:p>
+        </w:tc>
+        <w:tc>
+          <w:p>
+            <w:r>
+              <w:t xml:space="preserve">Structured JSON of caller record fields sent as state to Jev</w:t>
+            </w:r>
+          </w:p>
+        </w:tc>
+      </w:tr>
+      <w:tr>
+        <w:trPr/>
+        <w:tc>
+          <w:p>
+            <w:r>
+              <w:t xml:space="preserve">u_questions</w:t>
+            </w:r>
+          </w:p>
+        </w:tc>
+        <w:tc>
+          <w:p>
+            <w:r>
+              <w:t xml:space="preserve">String(4000)</w:t>
+            </w:r>
+          </w:p>
+        </w:tc>
+        <w:tc>
+          <w:p>
+            <w:r>
+              <w:t xml:space="preserve">JSON questions map auto-built by BR from field map config</w:t>
+            </w:r>
+          </w:p>
+        </w:tc>
+      </w:tr>
+      <w:tr>
+        <w:trPr/>
+        <w:tc>
+          <w:p>
+            <w:r>
+              <w:t xml:space="preserve">u_answers</w:t>
+            </w:r>
+          </w:p>
+        </w:tc>
+        <w:tc>
+          <w:p>
+            <w:r>
+              <w:t xml:space="preserve">String(4000)</w:t>
+            </w:r>
+          </w:p>
+        </w:tc>
+        <w:tc>
+          <w:p>
+            <w:r>
+              <w:t xml:space="preserve">Full raw Jev response answers JSON</w:t>
+            </w:r>
+          </w:p>
+        </w:tc>
+      </w:tr>
+      <w:tr>
+        <w:trPr/>
+        <w:tc>
+          <w:p>
+            <w:r>
+              <w:t xml:space="preserve">u_result_summary</w:t>
+            </w:r>
+          </w:p>
+        </w:tc>
+        <w:tc>
+          <w:p>
+            <w:r>
+              <w:t xml:space="preserve">String(4000)</w:t>
+            </w:r>
+          </w:p>
+        </w:tc>
+        <w:tc>
+          <w:p>
+            <w:r>
+              <w:t xml:space="preserve">Clean flat map: field to top answer value</w:t>
+            </w:r>
+          </w:p>
+        </w:tc>
+      </w:tr>
+      <w:tr>
+        <w:trPr/>
+        <w:tc>
+          <w:p>
+            <w:r>
+              <w:t xml:space="preserve">u_model</w:t>
+            </w:r>
+          </w:p>
+        </w:tc>
+        <w:tc>
+          <w:p>
+            <w:r>
+              <w:t xml:space="preserve">String(40)</w:t>
+            </w:r>
+          </w:p>
+        </w:tc>
+        <w:tc>
+          <w:p>
+            <w:r>
+              <w:t xml:space="preserve">Jev model (default: jev-1.13-free)</w:t>
+            </w:r>
+          </w:p>
+        </w:tc>
+      </w:tr>
+      <w:tr>
+        <w:trPr/>
+        <w:tc>
+          <w:p>
+            <w:r>
+              <w:t xml:space="preserve">u_model_used</w:t>
+            </w:r>
+          </w:p>
+        </w:tc>
+        <w:tc>
+          <w:p>
+            <w:r>
+              <w:t xml:space="preserve">String(40)</w:t>
+            </w:r>
+          </w:p>
+        </w:tc>
+        <w:tc>
+          <w:p>
+            <w:r>
+              <w:t xml:space="preserve">Actual model used as returned by Jev</w:t>
+            </w:r>
+          </w:p>
+        </w:tc>
+      </w:tr>
+      <w:tr>
+        <w:trPr/>
+        <w:tc>
+          <w:p>
+            <w:r>
+              <w:t xml:space="preserve">u_input_tokens / u_output_tokens</w:t>
+            </w:r>
+          </w:p>
+        </w:tc>
+        <w:tc>
+          <w:p>
+            <w:r>
+              <w:t xml:space="preserve">Integer</w:t>
+            </w:r>
+          </w:p>
+        </w:tc>
+        <w:tc>
+          <w:p>
+            <w:r>
+              <w:t xml:space="preserve">Token usage from Jev response</w:t>
+            </w:r>
+          </w:p>
+        </w:tc>
+      </w:tr>
+      <w:tr>
+        <w:trPr/>
+        <w:tc>
+          <w:p>
+            <w:r>
+              <w:t xml:space="preserve">u_caller_table</w:t>
+            </w:r>
+          </w:p>
+        </w:tc>
+        <w:tc>
+          <w:p>
+            <w:r>
+              <w:t xml:space="preserve">String(80)</w:t>
+            </w:r>
+          </w:p>
+        </w:tc>
+        <w:tc>
+          <w:p>
+            <w:r>
+              <w:t xml:space="preserve">Source SN table name, e.g. incident</w:t>
+            </w:r>
+          </w:p>
+        </w:tc>
+      </w:tr>
+      <w:tr>
+        <w:trPr/>
+        <w:tc>
+          <w:p>
+            <w:r>
+              <w:t xml:space="preserve">u_caller_sys_id</w:t>
+            </w:r>
+          </w:p>
+        </w:tc>
+        <w:tc>
+          <w:p>
+            <w:r>
+              <w:t xml:space="preserve">String(32)</w:t>
+            </w:r>
+          </w:p>
+        </w:tc>
+        <w:tc>
+          <w:p>
+            <w:r>
+              <w:t xml:space="preserve">sys_id of the source record</w:t>
+            </w:r>
+          </w:p>
+        </w:tc>
+      </w:tr>
+      <w:tr>
+        <w:trPr/>
+        <w:tc>
+          <w:p>
+            <w:r>
+              <w:t xml:space="preserve">u_caller_context</w:t>
+            </w:r>
+          </w:p>
+        </w:tc>
+        <w:tc>
+          <w:p>
+            <w:r>
+              <w:t xml:space="preserve">String(200)</w:t>
+            </w:r>
+          </w:p>
+        </w:tc>
+        <w:tc>
+          <w:p>
+            <w:r>
+              <w:t xml:space="preserve">Human-readable label e.g. INC0010048 - Wi-Fi issue</w:t>
+            </w:r>
+          </w:p>
+        </w:tc>
+      </w:tr>
+      <w:tr>
+        <w:trPr/>
+        <w:tc>
+          <w:p>
+            <w:r>
+              <w:t xml:space="preserve">u_jev_id</w:t>
+            </w:r>
+          </w:p>
+        </w:tc>
+        <w:tc>
+          <w:p>
+            <w:r>
+              <w:t xml:space="preserve">String(50)</w:t>
+            </w:r>
+          </w:p>
+        </w:tc>
+        <w:tc>
+          <w:p>
+            <w:r>
+              <w:t xml:space="preserve">Jev task ID returned by BeatAPI</w:t>
+            </w:r>
+          </w:p>
+        </w:tc>
+      </w:tr>
+      <w:tr>
+        <w:trPr/>
+        <w:tc>
+          <w:p>
+            <w:r>
+              <w:t xml:space="preserve">u_error</w:t>
+            </w:r>
+          </w:p>
+        </w:tc>
+        <w:tc>
+          <w:p>
+            <w:r>
+              <w:t xml:space="preserve">String(1000)</w:t>
+            </w:r>
+          </w:p>
+        </w:tc>
+        <w:tc>
+          <w:p>
+            <w:r>
+              <w:t xml:space="preserve">Error message if state=failed</w:t>
+            </w:r>
+          </w:p>
+        </w:tc>
+      </w:tr>
+      <w:tr>
+        <w:trPr/>
+        <w:tc>
+          <w:p>
+            <w:r>
+              <w:t xml:space="preserve">u_result</w:t>
+            </w:r>
+          </w:p>
+        </w:tc>
+        <w:tc>
+          <w:p>
+            <w:r>
+              <w:t xml:space="preserve">String(4000)</w:t>
+            </w:r>
+          </w:p>
+        </w:tc>
+        <w:tc>
+          <w:p>
+            <w:r>
+              <w:t xml:space="preserve">Generic result placeholder</w:t>
+            </w:r>
+          </w:p>
+        </w:tc>
+      </w:tr>
+      <w:tr>
+        <w:trPr/>
+        <w:tc>
+          <w:p>
+            <w:r>
+              <w:t xml:space="preserve">number</w:t>
+            </w:r>
+          </w:p>
+        </w:tc>
+        <w:tc>
+          <w:p>
+            <w:r>
+              <w:t xml:space="preserve">String(40)</w:t>
+            </w:r>
+          </w:p>
+        </w:tc>
+        <w:tc>
+          <w:p>
+            <w:r>
+              <w:t xml:space="preserve">Auto-number with prefix JEV e.g. JEV0000001</w:t>
+            </w:r>
+          </w:p>
+        </w:tc>
+      </w:tr>
+    </w:tbl>
+    <w:p>
+      <w:pPr>
+        <w:pStyle w:val="Heading2"/>
+      </w:pPr>
+      <w:r>
+        <w:rPr/>
+        <w:t xml:space="preserve">4.2 x_146833_jevnowint_field_map (Jev Field Map)</w:t>
+      </w:r>
+    </w:p>
+    <w:p>
+      <w:pPr/>
+      <w:r>
+        <w:rPr/>
+        <w:t xml:space="preserve">Config/lookup table. One row per field to evaluate per source table. Adding a new field mapping requires no code changes.</w:t>
+      </w:r>
+    </w:p>
+    <w:tbl>
+      <w:tblPr>
+        <w:tblW w:w="5000" w:type="pct"/>
+        <w:tblBorders>
+          <w:top w:val="single" w:sz="4"/>
+          <w:left w:val="single" w:sz="4"/>
+          <w:bottom w:val="single" w:sz="4"/>
+          <w:right w:val="single" w:sz="4"/>
+          <w:insideH w:val="single" w:sz="4"/>
+          <w:insideV w:val="single" w:sz="4"/>
+        </w:tblBorders>
+      </w:tblPr>
+      <w:tblGrid>
+        <w:gridCol w:w="2768"/>
+        <w:gridCol w:w="2768"/>
+        <w:gridCol w:w="2768"/>
+      </w:tblGrid>
+      <w:tr>
+        <w:trPr>
+          <w:tblHeader/>
+        </w:trPr>
+        <w:tc>
+          <w:p>
+            <w:r>
+              <w:t xml:space="preserve">Column</w:t>
+            </w:r>
+          </w:p>
+        </w:tc>
+        <w:tc>
+          <w:p>
+            <w:r>
+              <w:t xml:space="preserve">Type</w:t>
+            </w:r>
+          </w:p>
+        </w:tc>
+        <w:tc>
+          <w:p>
+            <w:r>
+              <w:t xml:space="preserve">Purpose</w:t>
+            </w:r>
+          </w:p>
+        </w:tc>
+      </w:tr>
+      <w:tr>
+        <w:trPr/>
+        <w:tc>
+          <w:p>
+            <w:r>
+              <w:t xml:space="preserve">u_source_table</w:t>
+            </w:r>
+          </w:p>
+        </w:tc>
+        <w:tc>
+          <w:p>
+            <w:r>
+              <w:t xml:space="preserve">String(80)</w:t>
+            </w:r>
+          </w:p>
+        </w:tc>
+        <w:tc>
+          <w:p>
+            <w:r>
+              <w:t xml:space="preserve">SN table name e.g. incident</w:t>
+            </w:r>
+          </w:p>
+        </w:tc>
+      </w:tr>
+      <w:tr>
+        <w:trPr/>
+        <w:tc>
+          <w:p>
+            <w:r>
+              <w:t xml:space="preserve">u_source_field</w:t>
+            </w:r>
+          </w:p>
+        </w:tc>
+        <w:tc>
+          <w:p>
+            <w:r>
+              <w:t xml:space="preserve">String(80)</w:t>
+            </w:r>
+          </w:p>
+        </w:tc>
+        <w:tc>
+          <w:p>
+            <w:r>
+              <w:t xml:space="preserve">Field name on that table e.g. severity</w:t>
+            </w:r>
+          </w:p>
+        </w:tc>
+      </w:tr>
+      <w:tr>
+        <w:trPr/>
+        <w:tc>
+          <w:p>
+            <w:r>
+              <w:t xml:space="preserve">u_jev_type</w:t>
+            </w:r>
+          </w:p>
+        </w:tc>
+        <w:tc>
+          <w:p>
+            <w:r>
+              <w:t xml:space="preserve">Choice</w:t>
+            </w:r>
+          </w:p>
+        </w:tc>
+        <w:tc>
+          <w:p>
+            <w:r>
+              <w:t xml:space="preserve">noul / choice / score</w:t>
+            </w:r>
+          </w:p>
+        </w:tc>
+      </w:tr>
+      <w:tr>
+        <w:trPr/>
+        <w:tc>
+          <w:p>
+            <w:r>
+              <w:t xml:space="preserve">u_choices</w:t>
+            </w:r>
+          </w:p>
+        </w:tc>
+        <w:tc>
+          <w:p>
+            <w:r>
+              <w:t xml:space="preserve">String(4000)</w:t>
+            </w:r>
+          </w:p>
+        </w:tc>
+        <w:tc>
+          <w:p>
+            <w:r>
+              <w:t xml:space="preserve">JSON array of option keys e.g. [1-High, 2-Medium, 3-Low]</w:t>
+            </w:r>
+          </w:p>
+        </w:tc>
+      </w:tr>
+      <w:tr>
+        <w:trPr/>
+        <w:tc>
+          <w:p>
+            <w:r>
+              <w:t xml:space="preserve">u_question</w:t>
+            </w:r>
+          </w:p>
+        </w:tc>
+        <w:tc>
+          <w:p>
+            <w:r>
+              <w:t xml:space="preserve">String(500)</w:t>
+            </w:r>
+          </w:p>
+        </w:tc>
+        <w:tc>
+          <w:p>
+            <w:r>
+              <w:t xml:space="preserve">Natural-language question text sent to Jev as instructions</w:t>
+            </w:r>
+          </w:p>
+        </w:tc>
+      </w:tr>
+      <w:tr>
+        <w:trPr/>
+        <w:tc>
+          <w:p>
+            <w:r>
+              <w:t xml:space="preserve">u_active</w:t>
+            </w:r>
+          </w:p>
+        </w:tc>
+        <w:tc>
+          <w:p>
+            <w:r>
+              <w:t xml:space="preserve">Boolean</w:t>
+            </w:r>
+          </w:p>
+        </w:tc>
+        <w:tc>
+          <w:p>
+            <w:r>
+              <w:t xml:space="preserve">Toggle row on/off without deleting (default: true)</w:t>
+            </w:r>
+          </w:p>
+        </w:tc>
+      </w:tr>
+    </w:tbl>
+    <w:p>
+      <w:pPr/>
+      <w:r>
+        <w:rPr/>
+        <w:t xml:space="preserve">Seeded rows for incident: impact (choice), urgency (choice), business_service (choice identifying which service is affected).</w:t>
+      </w:r>
+    </w:p>
+    <w:p>
+      <w:pPr>
+        <w:pStyle w:val="Heading1"/>
+      </w:pPr>
+      <w:r>
+        <w:rPr/>
+        <w:t xml:space="preserve">5. Script Includes</w:t>
+      </w:r>
+    </w:p>
+    <w:p>
+      <w:pPr>
+        <w:numPr>
+          <w:ilvl w:val="0"/>
+          <w:numId w:val="4"/>
+        </w:numPr>
+      </w:pPr>
+      <w:r>
+        <w:rPr/>
+        <w:t xml:space="preserve">JevClient: Fluent HTTP wrapper for the BeatAPI Jev endpoint.</w:t>
+      </w:r>
+    </w:p>
+    <w:p>
+      <w:pPr>
+        <w:numPr>
+          <w:ilvl w:val="0"/>
+          <w:numId w:val="4"/>
+        </w:numPr>
+      </w:pPr>
+      <w:r>
+        <w:rPr/>
+        <w:t xml:space="preserve">JevQuestions: Builder helpers for raw Jev primitives — noul(), choice(), score().</w:t>
+      </w:r>
+    </w:p>
+    <w:p>
+      <w:pPr>
+        <w:numPr>
+          <w:ilvl w:val="0"/>
+          <w:numId w:val="4"/>
+        </w:numPr>
+      </w:pPr>
+      <w:r>
+        <w:rPr/>
+        <w:t xml:space="preserve">JevFieldMap: Dynamic question builder. Queries x_146833_jevnowint_field_map and returns a ready-to-submit questions object. Usage: JevFieldMap.forRecord('incident', sys_id)</w:t>
+      </w:r>
+    </w:p>
+    <w:p>
+      <w:pPr>
+        <w:pStyle w:val="Heading1"/>
+      </w:pPr>
+      <w:r>
+        <w:rPr/>
+        <w:t xml:space="preserve">6. Business Rules</w:t>
+      </w:r>
+    </w:p>
+    <w:p>
+      <w:pPr>
+        <w:numPr>
+          <w:ilvl w:val="0"/>
+          <w:numId w:val="5"/>
+        </w:numPr>
+      </w:pPr>
+      <w:r>
+        <w:rPr/>
+        <w:t xml:space="preserve">Populate Jev Questions on Insert: Before insert on x_146833_jevnowint_request. Condition: u_caller_table and u_caller_sys_id are set and u_questions is empty. Calls JevFieldMap.forRecord() and writes u_questions and u_state_text.</w:t>
+      </w:r>
+    </w:p>
+    <w:p>
+      <w:pPr>
+        <w:numPr>
+          <w:ilvl w:val="0"/>
+          <w:numId w:val="5"/>
+        </w:numPr>
+      </w:pPr>
+      <w:r>
+        <w:rPr/>
+        <w:t xml:space="preserve">Populate Result Summary on Processed: After update on x_146833_jevnowint_request. Condition: u_state changes to processed. Reads u_answers and writes u_result_summary as a flat JSON map of field to top answer value.</w:t>
+      </w:r>
+    </w:p>
+    <w:p>
+      <w:pPr>
+        <w:pStyle w:val="Heading1"/>
+      </w:pPr>
+      <w:r>
+        <w:rPr/>
+        <w:t xml:space="preserve">7. Connection and Credential Alias</w:t>
+      </w:r>
+    </w:p>
+    <w:p>
+      <w:pPr/>
+      <w:r>
+        <w:rPr/>
+        <w:t xml:space="preserve">The Jev API key and endpoint are never stored in the repo. They are configured in SN using a Connection and Credential Alias named JevBeatAPI (x_146833_jevnowint.JevBeatAPI).</w:t>
+      </w:r>
+    </w:p>
+    <w:p>
+      <w:pPr/>
+      <w:r>
+        <w:rPr/>
+        <w:t xml:space="preserve">Credential type: HTTP Header. Header name: Authorization. Header value: Bearer sk-... (your TypeSafe Jev API key). Connection URL: https://api.beatapi.io/v1/systemone. Set separately in each SN instance (DEV and PROD).</w:t>
+      </w:r>
+    </w:p>
+    <w:p>
+      <w:pPr>
+        <w:pStyle w:val="Heading1"/>
+      </w:pPr>
+      <w:r>
+        <w:rPr/>
+        <w:t xml:space="preserve">8. Proof of Concept</w:t>
+      </w:r>
+    </w:p>
+    <w:p>
+      <w:pPr/>
+      <w:r>
+        <w:rPr/>
+        <w:t xml:space="preserve">Test run: Incident INC0010048 (Office Wi-Fi intermittent in meeting rooms B4 and B5). Impact: 2-Medium, Urgency: 2-Medium, no business service assigned in SN.</w:t>
+      </w:r>
+    </w:p>
+    <w:p>
+      <w:pPr/>
+      <w:r>
+        <w:rPr/>
+        <w:t xml:space="preserve">Jev Result: {urgency: 2-Medium, impact: 2-Medium, business_service: Corporate Network}</w:t>
+      </w:r>
+    </w:p>
+    <w:tbl>
+      <w:tblPr>
+        <w:tblW w:w="5000" w:type="pct"/>
+        <w:tblBorders>
+          <w:top w:val="single" w:sz="4"/>
+          <w:left w:val="single" w:sz="4"/>
+          <w:bottom w:val="single" w:sz="4"/>
+          <w:right w:val="single" w:sz="4"/>
+          <w:insideH w:val="single" w:sz="4"/>
+          <w:insideV w:val="single" w:sz="4"/>
+        </w:tblBorders>
+      </w:tblPr>
+      <w:tblGrid>
+        <w:gridCol w:w="2076"/>
+        <w:gridCol w:w="2076"/>
+        <w:gridCol w:w="2076"/>
+        <w:gridCol w:w="2076"/>
+      </w:tblGrid>
+      <w:tr>
+        <w:trPr>
+          <w:tblHeader/>
+        </w:trPr>
+        <w:tc>
+          <w:p>
+            <w:r>
+              <w:t xml:space="preserve">Question</w:t>
+            </w:r>
+          </w:p>
+        </w:tc>
+        <w:tc>
+          <w:p>
+            <w:r>
+              <w:t xml:space="preserve">Answer</w:t>
+            </w:r>
+          </w:p>
+        </w:tc>
+        <w:tc>
+          <w:p>
+            <w:r>
+              <w:t xml:space="preserve">Confidence</w:t>
+            </w:r>
+          </w:p>
+        </w:tc>
+        <w:tc>
+          <w:p>
+            <w:r>
+              <w:t xml:space="preserve">Top Probabilities</w:t>
+            </w:r>
+          </w:p>
+        </w:tc>
+      </w:tr>
+      <w:tr>
+        <w:trPr/>
+        <w:tc>
+          <w:p>
+            <w:r>
+              <w:t xml:space="preserve">urgency</w:t>
+            </w:r>
+          </w:p>
+        </w:tc>
+        <w:tc>
+          <w:p>
+            <w:r>
+              <w:t xml:space="preserve">2 - Medium</w:t>
+            </w:r>
+          </w:p>
+        </w:tc>
+        <w:tc>
+          <w:p>
+            <w:r>
+              <w:t xml:space="preserve">0.85</w:t>
+            </w:r>
+          </w:p>
+        </w:tc>
+        <w:tc>
+          <w:p>
+            <w:r>
+              <w:t xml:space="preserve">2-Medium: 0.90, 1-High: 0.10</w:t>
+            </w:r>
+          </w:p>
+        </w:tc>
+      </w:tr>
+      <w:tr>
+        <w:trPr/>
+        <w:tc>
+          <w:p>
+            <w:r>
+              <w:t xml:space="preserve">impact</w:t>
+            </w:r>
+          </w:p>
+        </w:tc>
+        <w:tc>
+          <w:p>
+            <w:r>
+              <w:t xml:space="preserve">2 - Medium</w:t>
+            </w:r>
+          </w:p>
+        </w:tc>
+        <w:tc>
+          <w:p>
+            <w:r>
+              <w:t xml:space="preserve">0.96</w:t>
+            </w:r>
+          </w:p>
+        </w:tc>
+        <w:tc>
+          <w:p>
+            <w:r>
+              <w:t xml:space="preserve">2-Medium: 0.97, 1-High: 0.03</w:t>
+            </w:r>
+          </w:p>
+        </w:tc>
+      </w:tr>
+      <w:tr>
+        <w:trPr/>
+        <w:tc>
+          <w:p>
+            <w:r>
+              <w:t xml:space="preserve">business_service</w:t>
+            </w:r>
+          </w:p>
+        </w:tc>
+        <w:tc>
+          <w:p>
+            <w:r>
+              <w:t xml:space="preserve">Corporate Network</w:t>
+            </w:r>
+          </w:p>
+        </w:tc>
+        <w:tc>
+          <w:p>
+            <w:r>
+              <w:t xml:space="preserve">0.98</w:t>
+            </w:r>
+          </w:p>
+        </w:tc>
+        <w:tc>
+          <w:p>
+            <w:r>
+              <w:t xml:space="preserve">Corporate Network: 0.98, others: 0.0</w:t>
+            </w:r>
+          </w:p>
+        </w:tc>
+      </w:tr>
+      <w:tr>
+        <w:trPr/>
+        <w:tc>
+          <w:p>
+            <w:r>
+              <w:t xml:space="preserve">Tokens</w:t>
+            </w:r>
+          </w:p>
+        </w:tc>
+        <w:tc>
+          <w:p>
+            <w:r>
+              <w:t xml:space="preserve">Input: 661 / Output: 156</w:t>
+            </w:r>
+          </w:p>
+        </w:tc>
+        <w:tc>
+          <w:p/>
+        </w:tc>
+        <w:tc>
+          <w:p>
+            <w:r>
+              <w:t xml:space="preserve">Model: jev-1.13-free, Jev ID: task_dx5COsnAMmYwAay...</w:t>
+            </w:r>
+          </w:p>
+        </w:tc>
+      </w:tr>
+    </w:tbl>
+    <w:p>
+      <w:pPr/>
+      <w:r>
+        <w:rPr/>
+        <w:t xml:space="preserve">Jev inferred Corporate Network from the incident description alone (Wi-Fi, wired ethernet, video calls) even though no business service was assigned in SN. This demonstrates Jev reasoning over unstructured text.</w:t>
+      </w:r>
+    </w:p>
+    <w:p>
+      <w:pPr>
+        <w:pStyle w:val="Heading1"/>
+      </w:pPr>
+      <w:r>
+        <w:rPr/>
+        <w:t xml:space="preserve">9. Future Use Cases</w:t>
+      </w:r>
+    </w:p>
+    <w:p>
+      <w:pPr>
+        <w:pStyle w:val="Heading2"/>
+      </w:pPr>
+      <w:r>
+        <w:rPr/>
+        <w:t xml:space="preserve">9.1 Change Management - Change Risk Assessment</w:t>
+      </w:r>
+    </w:p>
+    <w:p>
+      <w:pPr/>
+      <w:r>
+        <w:rPr/>
+        <w:t xml:space="preserve">Table: change_request. Jev evaluates each change request before CAB approval to produce a structured risk profile covering disruption risk, risk category, overall risk score, and affected services. Output used to auto-set risk fields, flag changes for CAB review, and suggest assignment groups.</w:t>
+      </w:r>
+    </w:p>
+    <w:p>
+      <w:pPr>
+        <w:pStyle w:val="Heading2"/>
+      </w:pPr>
+      <w:r>
+        <w:rPr/>
+        <w:t xml:space="preserve">9.2 IRM - Control Objectives and Entity Applicability</w:t>
+      </w:r>
+    </w:p>
+    <w:p>
+      <w:pPr/>
+      <w:r>
+        <w:rPr/>
+        <w:t xml:space="preserve">Table: sn_compliance_policy_statement or custom IRM table. Jev assesses whether a given control objective applies to a specific entity such as a system, vendor, or process. Output used to auto-populate applicability assessments across large control libraries, surface high-applicability controls for mandatory evidence collection, and flag ambiguous controls for human review based on low confidence scores.</w:t>
+      </w:r>
+    </w:p>
+    <w:p>
+      <w:pPr>
+        <w:pStyle w:val="Heading2"/>
+      </w:pPr>
+      <w:r>
+        <w:rPr/>
+        <w:t xml:space="preserve">9.3 SecOps - Vulnerability Threat Level and False Positive Validation</w:t>
+      </w:r>
+    </w:p>
+    <w:p>
+      <w:pPr/>
+      <w:r>
+        <w:rPr/>
+        <w:t xml:space="preserve">Table: sn_si_vulnerability or sn_vul_vulnerable_item. Jev assesses the real-world threat level of a vulnerability given asset context, and validates whether an alert is a genuine threat or a false positive. Questions: actual threat severity (score), remediation priority (choice), false positive likelihood (noul), active exploitability (noul). Output used to re-prioritise vulnerability queues beyond raw CVSS score, auto-close likely false positives above 0.90 confidence for human confirmation, and escalate actively exploitable vulnerabilities to P1 immediately.</w:t>
+      </w:r>
+    </w:p>
     <w:sectPr>
       <w:pgSz w:w="11906" w:h="16838"/>
       <w:pgMar w:top="1440" w:right="1800" w:bottom="1440" w:left="1800"/>
@@ -320,8 +1330,356 @@
       </w:pPr>
     </w:lvl>
   </w:abstractNum>
+  <w:abstractNum w:abstractNumId="1">
+    <w:multiLevelType w:val="hybridMultilevel"/>
+    <w:lvl w:ilvl="0">
+      <w:start w:val="1"/>
+      <w:numFmt w:val="bullet"/>
+      <w:lvlText w:val="•"/>
+      <w:lvlJc w:val="left"/>
+      <w:pPr>
+        <w:ind w:left="720" w:hanging="360"/>
+      </w:pPr>
+    </w:lvl>
+    <w:lvl w:ilvl="1">
+      <w:start w:val="1"/>
+      <w:numFmt w:val="bullet"/>
+      <w:lvlText w:val="◦"/>
+      <w:lvlJc w:val="left"/>
+      <w:pPr>
+        <w:ind w:left="1440" w:hanging="360"/>
+      </w:pPr>
+    </w:lvl>
+    <w:lvl w:ilvl="2">
+      <w:start w:val="1"/>
+      <w:numFmt w:val="bullet"/>
+      <w:lvlText w:val="▪"/>
+      <w:lvlJc w:val="left"/>
+      <w:pPr>
+        <w:ind w:left="2160" w:hanging="360"/>
+      </w:pPr>
+    </w:lvl>
+    <w:lvl w:ilvl="3">
+      <w:start w:val="1"/>
+      <w:numFmt w:val="bullet"/>
+      <w:lvlText w:val="•"/>
+      <w:lvlJc w:val="left"/>
+      <w:pPr>
+        <w:ind w:left="2880" w:hanging="360"/>
+      </w:pPr>
+    </w:lvl>
+    <w:lvl w:ilvl="4">
+      <w:start w:val="1"/>
+      <w:numFmt w:val="bullet"/>
+      <w:lvlText w:val="◦"/>
+      <w:lvlJc w:val="left"/>
+      <w:pPr>
+        <w:ind w:left="3600" w:hanging="360"/>
+      </w:pPr>
+    </w:lvl>
+    <w:lvl w:ilvl="5">
+      <w:start w:val="1"/>
+      <w:numFmt w:val="bullet"/>
+      <w:lvlText w:val="▪"/>
+      <w:lvlJc w:val="left"/>
+      <w:pPr>
+        <w:ind w:left="4320" w:hanging="360"/>
+      </w:pPr>
+    </w:lvl>
+    <w:lvl w:ilvl="6">
+      <w:start w:val="1"/>
+      <w:numFmt w:val="bullet"/>
+      <w:lvlText w:val="•"/>
+      <w:lvlJc w:val="left"/>
+      <w:pPr>
+        <w:ind w:left="5040" w:hanging="360"/>
+      </w:pPr>
+    </w:lvl>
+    <w:lvl w:ilvl="7">
+      <w:start w:val="1"/>
+      <w:numFmt w:val="bullet"/>
+      <w:lvlText w:val="◦"/>
+      <w:lvlJc w:val="left"/>
+      <w:pPr>
+        <w:ind w:left="5760" w:hanging="360"/>
+      </w:pPr>
+    </w:lvl>
+    <w:lvl w:ilvl="8">
+      <w:start w:val="1"/>
+      <w:numFmt w:val="bullet"/>
+      <w:lvlText w:val="▪"/>
+      <w:lvlJc w:val="left"/>
+      <w:pPr>
+        <w:ind w:left="6480" w:hanging="360"/>
+      </w:pPr>
+    </w:lvl>
+  </w:abstractNum>
+  <w:abstractNum w:abstractNumId="2">
+    <w:multiLevelType w:val="hybridMultilevel"/>
+    <w:lvl w:ilvl="0">
+      <w:start w:val="1"/>
+      <w:numFmt w:val="bullet"/>
+      <w:lvlText w:val="•"/>
+      <w:lvlJc w:val="left"/>
+      <w:pPr>
+        <w:ind w:left="720" w:hanging="360"/>
+      </w:pPr>
+    </w:lvl>
+    <w:lvl w:ilvl="1">
+      <w:start w:val="1"/>
+      <w:numFmt w:val="bullet"/>
+      <w:lvlText w:val="◦"/>
+      <w:lvlJc w:val="left"/>
+      <w:pPr>
+        <w:ind w:left="1440" w:hanging="360"/>
+      </w:pPr>
+    </w:lvl>
+    <w:lvl w:ilvl="2">
+      <w:start w:val="1"/>
+      <w:numFmt w:val="bullet"/>
+      <w:lvlText w:val="▪"/>
+      <w:lvlJc w:val="left"/>
+      <w:pPr>
+        <w:ind w:left="2160" w:hanging="360"/>
+      </w:pPr>
+    </w:lvl>
+    <w:lvl w:ilvl="3">
+      <w:start w:val="1"/>
+      <w:numFmt w:val="bullet"/>
+      <w:lvlText w:val="•"/>
+      <w:lvlJc w:val="left"/>
+      <w:pPr>
+        <w:ind w:left="2880" w:hanging="360"/>
+      </w:pPr>
+    </w:lvl>
+    <w:lvl w:ilvl="4">
+      <w:start w:val="1"/>
+      <w:numFmt w:val="bullet"/>
+      <w:lvlText w:val="◦"/>
+      <w:lvlJc w:val="left"/>
+      <w:pPr>
+        <w:ind w:left="3600" w:hanging="360"/>
+      </w:pPr>
+    </w:lvl>
+    <w:lvl w:ilvl="5">
+      <w:start w:val="1"/>
+      <w:numFmt w:val="bullet"/>
+      <w:lvlText w:val="▪"/>
+      <w:lvlJc w:val="left"/>
+      <w:pPr>
+        <w:ind w:left="4320" w:hanging="360"/>
+      </w:pPr>
+    </w:lvl>
+    <w:lvl w:ilvl="6">
+      <w:start w:val="1"/>
+      <w:numFmt w:val="bullet"/>
+      <w:lvlText w:val="•"/>
+      <w:lvlJc w:val="left"/>
+      <w:pPr>
+        <w:ind w:left="5040" w:hanging="360"/>
+      </w:pPr>
+    </w:lvl>
+    <w:lvl w:ilvl="7">
+      <w:start w:val="1"/>
+      <w:numFmt w:val="bullet"/>
+      <w:lvlText w:val="◦"/>
+      <w:lvlJc w:val="left"/>
+      <w:pPr>
+        <w:ind w:left="5760" w:hanging="360"/>
+      </w:pPr>
+    </w:lvl>
+    <w:lvl w:ilvl="8">
+      <w:start w:val="1"/>
+      <w:numFmt w:val="bullet"/>
+      <w:lvlText w:val="▪"/>
+      <w:lvlJc w:val="left"/>
+      <w:pPr>
+        <w:ind w:left="6480" w:hanging="360"/>
+      </w:pPr>
+    </w:lvl>
+  </w:abstractNum>
+  <w:abstractNum w:abstractNumId="3">
+    <w:multiLevelType w:val="hybridMultilevel"/>
+    <w:lvl w:ilvl="0">
+      <w:start w:val="1"/>
+      <w:numFmt w:val="bullet"/>
+      <w:lvlText w:val="•"/>
+      <w:lvlJc w:val="left"/>
+      <w:pPr>
+        <w:ind w:left="720" w:hanging="360"/>
+      </w:pPr>
+    </w:lvl>
+    <w:lvl w:ilvl="1">
+      <w:start w:val="1"/>
+      <w:numFmt w:val="bullet"/>
+      <w:lvlText w:val="◦"/>
+      <w:lvlJc w:val="left"/>
+      <w:pPr>
+        <w:ind w:left="1440" w:hanging="360"/>
+      </w:pPr>
+    </w:lvl>
+    <w:lvl w:ilvl="2">
+      <w:start w:val="1"/>
+      <w:numFmt w:val="bullet"/>
+      <w:lvlText w:val="▪"/>
+      <w:lvlJc w:val="left"/>
+      <w:pPr>
+        <w:ind w:left="2160" w:hanging="360"/>
+      </w:pPr>
+    </w:lvl>
+    <w:lvl w:ilvl="3">
+      <w:start w:val="1"/>
+      <w:numFmt w:val="bullet"/>
+      <w:lvlText w:val="•"/>
+      <w:lvlJc w:val="left"/>
+      <w:pPr>
+        <w:ind w:left="2880" w:hanging="360"/>
+      </w:pPr>
+    </w:lvl>
+    <w:lvl w:ilvl="4">
+      <w:start w:val="1"/>
+      <w:numFmt w:val="bullet"/>
+      <w:lvlText w:val="◦"/>
+      <w:lvlJc w:val="left"/>
+      <w:pPr>
+        <w:ind w:left="3600" w:hanging="360"/>
+      </w:pPr>
+    </w:lvl>
+    <w:lvl w:ilvl="5">
+      <w:start w:val="1"/>
+      <w:numFmt w:val="bullet"/>
+      <w:lvlText w:val="▪"/>
+      <w:lvlJc w:val="left"/>
+      <w:pPr>
+        <w:ind w:left="4320" w:hanging="360"/>
+      </w:pPr>
+    </w:lvl>
+    <w:lvl w:ilvl="6">
+      <w:start w:val="1"/>
+      <w:numFmt w:val="bullet"/>
+      <w:lvlText w:val="•"/>
+      <w:lvlJc w:val="left"/>
+      <w:pPr>
+        <w:ind w:left="5040" w:hanging="360"/>
+      </w:pPr>
+    </w:lvl>
+    <w:lvl w:ilvl="7">
+      <w:start w:val="1"/>
+      <w:numFmt w:val="bullet"/>
+      <w:lvlText w:val="◦"/>
+      <w:lvlJc w:val="left"/>
+      <w:pPr>
+        <w:ind w:left="5760" w:hanging="360"/>
+      </w:pPr>
+    </w:lvl>
+    <w:lvl w:ilvl="8">
+      <w:start w:val="1"/>
+      <w:numFmt w:val="bullet"/>
+      <w:lvlText w:val="▪"/>
+      <w:lvlJc w:val="left"/>
+      <w:pPr>
+        <w:ind w:left="6480" w:hanging="360"/>
+      </w:pPr>
+    </w:lvl>
+  </w:abstractNum>
+  <w:abstractNum w:abstractNumId="4">
+    <w:multiLevelType w:val="hybridMultilevel"/>
+    <w:lvl w:ilvl="0">
+      <w:start w:val="1"/>
+      <w:numFmt w:val="bullet"/>
+      <w:lvlText w:val="•"/>
+      <w:lvlJc w:val="left"/>
+      <w:pPr>
+        <w:ind w:left="720" w:hanging="360"/>
+      </w:pPr>
+    </w:lvl>
+    <w:lvl w:ilvl="1">
+      <w:start w:val="1"/>
+      <w:numFmt w:val="bullet"/>
+      <w:lvlText w:val="◦"/>
+      <w:lvlJc w:val="left"/>
+      <w:pPr>
+        <w:ind w:left="1440" w:hanging="360"/>
+      </w:pPr>
+    </w:lvl>
+    <w:lvl w:ilvl="2">
+      <w:start w:val="1"/>
+      <w:numFmt w:val="bullet"/>
+      <w:lvlText w:val="▪"/>
+      <w:lvlJc w:val="left"/>
+      <w:pPr>
+        <w:ind w:left="2160" w:hanging="360"/>
+      </w:pPr>
+    </w:lvl>
+    <w:lvl w:ilvl="3">
+      <w:start w:val="1"/>
+      <w:numFmt w:val="bullet"/>
+      <w:lvlText w:val="•"/>
+      <w:lvlJc w:val="left"/>
+      <w:pPr>
+        <w:ind w:left="2880" w:hanging="360"/>
+      </w:pPr>
+    </w:lvl>
+    <w:lvl w:ilvl="4">
+      <w:start w:val="1"/>
+      <w:numFmt w:val="bullet"/>
+      <w:lvlText w:val="◦"/>
+      <w:lvlJc w:val="left"/>
+      <w:pPr>
+        <w:ind w:left="3600" w:hanging="360"/>
+      </w:pPr>
+    </w:lvl>
+    <w:lvl w:ilvl="5">
+      <w:start w:val="1"/>
+      <w:numFmt w:val="bullet"/>
+      <w:lvlText w:val="▪"/>
+      <w:lvlJc w:val="left"/>
+      <w:pPr>
+        <w:ind w:left="4320" w:hanging="360"/>
+      </w:pPr>
+    </w:lvl>
+    <w:lvl w:ilvl="6">
+      <w:start w:val="1"/>
+      <w:numFmt w:val="bullet"/>
+      <w:lvlText w:val="•"/>
+      <w:lvlJc w:val="left"/>
+      <w:pPr>
+        <w:ind w:left="5040" w:hanging="360"/>
+      </w:pPr>
+    </w:lvl>
+    <w:lvl w:ilvl="7">
+      <w:start w:val="1"/>
+      <w:numFmt w:val="bullet"/>
+      <w:lvlText w:val="◦"/>
+      <w:lvlJc w:val="left"/>
+      <w:pPr>
+        <w:ind w:left="5760" w:hanging="360"/>
+      </w:pPr>
+    </w:lvl>
+    <w:lvl w:ilvl="8">
+      <w:start w:val="1"/>
+      <w:numFmt w:val="bullet"/>
+      <w:lvlText w:val="▪"/>
+      <w:lvlJc w:val="left"/>
+      <w:pPr>
+        <w:ind w:left="6480" w:hanging="360"/>
+      </w:pPr>
+    </w:lvl>
+  </w:abstractNum>
   <w:num w:numId="1">
     <w:abstractNumId w:val="0"/>
+  </w:num>
+  <w:num w:numId="2">
+    <w:abstractNumId w:val="1"/>
+  </w:num>
+  <w:num w:numId="3">
+    <w:abstractNumId w:val="2"/>
+  </w:num>
+  <w:num w:numId="4">
+    <w:abstractNumId w:val="3"/>
+  </w:num>
+  <w:num w:numId="5">
+    <w:abstractNumId w:val="4"/>
   </w:num>
 </w:numbering>
 </file>
@@ -344,6 +1702,81 @@
     <w:pPr>
       <w:spacing w:after="0" w:line="259" w:lineRule="auto"/>
     </w:pPr>
+  </w:style>
+  <w:style w:type="paragraph" w:styleId="Title">
+    <w:name w:val="Title"/>
+    <w:basedOn w:val="Normal"/>
+    <w:next w:val="Normal"/>
+    <w:uiPriority w:val="10"/>
+    <w:qFormat/>
+    <w:pPr>
+      <w:spacing w:after="0" w:line="240" w:lineRule="auto"/>
+      <w:contextualSpacing/>
+    </w:pPr>
+    <w:rPr>
+      <w:rFonts w:asciiTheme="majorHAnsi" w:hAnsiTheme="majorHAnsi" w:eastAsiaTheme="majorEastAsia" w:cstheme="majorBidi"/>
+      <w:spacing w:val="-10"/>
+      <w:kern w:val="28"/>
+      <w:sz w:val="56"/>
+      <w:szCs w:val="56"/>
+    </w:rPr>
+  </w:style>
+  <w:style w:type="paragraph" w:styleId="Subtitle">
+    <w:name w:val="Subtitle"/>
+    <w:basedOn w:val="Normal"/>
+    <w:next w:val="Normal"/>
+    <w:uiPriority w:val="10"/>
+    <w:qFormat/>
+    <w:pPr>
+      <w:spacing w:after="0" w:line="240" w:lineRule="auto"/>
+      <w:contextualSpacing/>
+    </w:pPr>
+    <w:rPr>
+      <w:rFonts w:asciiTheme="majorHAnsi" w:hAnsiTheme="majorHAnsi" w:eastAsiaTheme="majorEastAsia" w:cstheme="majorBidi"/>
+      <w:color w:val="5A5A5A"/>
+      <w:sz w:val="22"/>
+      <w:szCs w:val="22"/>
+    </w:rPr>
+  </w:style>
+  <w:style w:type="paragraph" w:styleId="Heading1">
+    <w:name w:val="heading 1"/>
+    <w:basedOn w:val="Normal"/>
+    <w:next w:val="Normal"/>
+    <w:uiPriority w:val="9"/>
+    <w:qFormat/>
+    <w:pPr>
+      <w:keepNext/>
+      <w:keepLines/>
+      <w:spacing w:before="240" w:after="0"/>
+      <w:outlineLvl w:val="0"/>
+    </w:pPr>
+    <w:rPr>
+      <w:rFonts w:asciiTheme="majorHAnsi" w:hAnsiTheme="majorHAnsi" w:eastAsiaTheme="majorEastAsia" w:cstheme="majorBidi"/>
+      <w:color w:val="2F5496"/>
+      <w:sz w:val="32"/>
+      <w:szCs w:val="32"/>
+    </w:rPr>
+  </w:style>
+  <w:style w:type="paragraph" w:styleId="Heading2">
+    <w:name w:val="heading 2"/>
+    <w:basedOn w:val="Normal"/>
+    <w:next w:val="Normal"/>
+    <w:uiPriority w:val="9"/>
+    <w:semiHidden/>
+    <w:unhideWhenUsed/>
+    <w:qFormat/>
+    <w:pPr>
+      <w:keepNext/>
+      <w:keepLines/>
+      <w:spacing w:before="40" w:after="0"/>
+      <w:outlineLvl w:val="1"/>
+    </w:pPr>
+    <w:rPr>
+      <w:rFonts w:asciiTheme="majorHAnsi" w:hAnsiTheme="majorHAnsi" w:eastAsiaTheme="majorEastAsia" w:cstheme="majorBidi"/>
+      <w:color w:val="2F5496"/>
+      <w:sz w:val="26"/>
+      <w:szCs w:val="26"/>
+    </w:rPr>
   </w:style>
 </w:styles>
 </file>

</xml_diff>

<commit_message>
docs: add post-deploy credential setup and full code promotion guide with troubleshooting
</commit_message>
<xml_diff>
--- a/docs/JevNowIntegration.docx
+++ b/docs/JevNowIntegration.docx
@@ -2808,6 +2808,296 @@
         </w:tc>
       </w:tr>
     </w:tbl>
+    <w:p>
+      <w:pPr>
+        <w:pStyle w:val="Heading1"/>
+      </w:pPr>
+      <w:r>
+        <w:rPr/>
+        <w:t xml:space="preserve">14. Code Promotion — mydev to nowdev to prod</w:t>
+      </w:r>
+    </w:p>
+    <w:p>
+      <w:pPr/>
+      <w:r>
+        <w:rPr/>
+        <w:t xml:space="preserve">This is the full promotion sequence used to take changes from development through to production. GitHub environments must be named exactly dev and production (lowercase) to match the environment: keys in deploy.yml. A name mismatch causes secrets to resolve to empty strings and the deploy fails with Missing required argument for --add.</w:t>
+      </w:r>
+    </w:p>
+    <w:p>
+      <w:pPr>
+        <w:pStyle w:val="Heading2"/>
+      </w:pPr>
+      <w:r>
+        <w:rPr/>
+        <w:t xml:space="preserve">Prerequisites</w:t>
+      </w:r>
+    </w:p>
+    <w:p>
+      <w:pPr>
+        <w:numPr>
+          <w:ilvl w:val="0"/>
+          <w:numId w:val="11"/>
+        </w:numPr>
+      </w:pPr>
+      <w:r>
+        <w:rPr/>
+        <w:t xml:space="preserve">GitHub environments dev and production exist under repo &gt; Settings &gt; Environments.</w:t>
+      </w:r>
+    </w:p>
+    <w:p>
+      <w:pPr>
+        <w:numPr>
+          <w:ilvl w:val="0"/>
+          <w:numId w:val="11"/>
+        </w:numPr>
+      </w:pPr>
+      <w:r>
+        <w:rPr/>
+        <w:t xml:space="preserve">All 6 secrets are set in the correct environments (SN_DEV_INSTANCE, SN_DEV_USER, SN_DEV_PASS in dev; SN_PROD_INSTANCE, SN_PROD_USER, SN_PROD_PASS in production).</w:t>
+      </w:r>
+    </w:p>
+    <w:p>
+      <w:pPr>
+        <w:numPr>
+          <w:ilvl w:val="0"/>
+          <w:numId w:val="11"/>
+        </w:numPr>
+      </w:pPr>
+      <w:r>
+        <w:rPr/>
+        <w:t xml:space="preserve">mydev is clean and all SN changes have been pulled.</w:t>
+      </w:r>
+    </w:p>
+    <w:p>
+      <w:pPr>
+        <w:pStyle w:val="Heading2"/>
+      </w:pPr>
+      <w:r>
+        <w:rPr/>
+        <w:t xml:space="preserve">Step 1: Pull latest from SN DEV into mydev</w:t>
+      </w:r>
+    </w:p>
+    <w:p>
+      <w:pPr/>
+      <w:r>
+        <w:rPr/>
+        <w:t xml:space="preserve">GitHub &gt; Actions &gt; Pull from ServiceNow &gt; Run workflow &gt; branch: mydev. Then locally: git pull --rebase origin mydev.</w:t>
+      </w:r>
+    </w:p>
+    <w:p>
+      <w:pPr>
+        <w:pStyle w:val="Heading2"/>
+      </w:pPr>
+      <w:r>
+        <w:rPr/>
+        <w:t xml:space="preserve">Step 2: Deploy to SN DEV (mydev to nowdev)</w:t>
+      </w:r>
+    </w:p>
+    <w:p>
+      <w:pPr/>
+      <w:r>
+        <w:rPr/>
+        <w:t xml:space="preserve">git checkout nowdev &gt; git merge mydev --no-ff -m 'merge: description' &gt; git push origin nowdev &gt; git checkout mydev. GitHub Actions deploy.yml triggers automatically: Build &gt; Deploy &gt; DEV Instance.</w:t>
+      </w:r>
+    </w:p>
+    <w:p>
+      <w:pPr>
+        <w:pStyle w:val="Heading2"/>
+      </w:pPr>
+      <w:r>
+        <w:rPr/>
+        <w:t xml:space="preserve">Step 3: Verify in SN DEV</w:t>
+      </w:r>
+    </w:p>
+    <w:p>
+      <w:pPr/>
+      <w:r>
+        <w:rPr/>
+        <w:t xml:space="preserve">Confirm tables, flows, script includes, and BRs are correct. Run any fix scripts needed. Test end-to-end by creating a x_146833_jevnowint_request record with u_caller_table, u_caller_sys_id, and u_state=pending.</w:t>
+      </w:r>
+    </w:p>
+    <w:p>
+      <w:pPr>
+        <w:pStyle w:val="Heading2"/>
+      </w:pPr>
+      <w:r>
+        <w:rPr/>
+        <w:t xml:space="preserve">Step 4: Deploy to SN PROD (nowdev to prod)</w:t>
+      </w:r>
+    </w:p>
+    <w:p>
+      <w:pPr/>
+      <w:r>
+        <w:rPr/>
+        <w:t xml:space="preserve">git checkout prod &gt; git merge nowdev --no-ff -m 'merge: promote to prod' &gt; git push origin prod &gt; git checkout mydev. GitHub Actions deploy.yml triggers automatically: Build &gt; Deploy &gt; PROD Instance.</w:t>
+      </w:r>
+    </w:p>
+    <w:p>
+      <w:pPr>
+        <w:pStyle w:val="Heading2"/>
+      </w:pPr>
+      <w:r>
+        <w:rPr/>
+        <w:t xml:space="preserve">Step 5: Post-deploy PROD setup (first time only)</w:t>
+      </w:r>
+    </w:p>
+    <w:p>
+      <w:pPr/>
+      <w:r>
+        <w:rPr/>
+        <w:t xml:space="preserve">The JevBeatAPI connection alias shell is deployed automatically but the credential and connection URL must be set manually: (1) Connections and Credentials &gt; Connection and Credential Aliases &gt; JevBeatAPI. (2) Credentials tab &gt; New &gt; HTTP Header &gt; Authorization &gt; Bearer sk-xxxx (API key from https://console.typesafe.ai). (3) Connections tab &gt; New &gt; Connection URL: https://api.beatapi.io/v1/systemone &gt; select credential above. (4) Save.</w:t>
+      </w:r>
+    </w:p>
+    <w:p>
+      <w:pPr>
+        <w:pStyle w:val="Heading2"/>
+      </w:pPr>
+      <w:r>
+        <w:rPr/>
+        <w:t xml:space="preserve">Troubleshooting</w:t>
+      </w:r>
+    </w:p>
+    <w:tbl>
+      <w:tblPr>
+        <w:tblW w:w="5000" w:type="pct"/>
+        <w:tblBorders>
+          <w:top w:val="single" w:sz="4"/>
+          <w:left w:val="single" w:sz="4"/>
+          <w:bottom w:val="single" w:sz="4"/>
+          <w:right w:val="single" w:sz="4"/>
+          <w:insideH w:val="single" w:sz="4"/>
+          <w:insideV w:val="single" w:sz="4"/>
+        </w:tblBorders>
+      </w:tblPr>
+      <w:tblGrid>
+        <w:gridCol w:w="2768"/>
+        <w:gridCol w:w="2768"/>
+        <w:gridCol w:w="2768"/>
+      </w:tblGrid>
+      <w:tr>
+        <w:trPr>
+          <w:tblHeader/>
+        </w:trPr>
+        <w:tc>
+          <w:p>
+            <w:r>
+              <w:t xml:space="preserve">Symptom</w:t>
+            </w:r>
+          </w:p>
+        </w:tc>
+        <w:tc>
+          <w:p>
+            <w:r>
+              <w:t xml:space="preserve">Cause</w:t>
+            </w:r>
+          </w:p>
+        </w:tc>
+        <w:tc>
+          <w:p>
+            <w:r>
+              <w:t xml:space="preserve">Fix</w:t>
+            </w:r>
+          </w:p>
+        </w:tc>
+      </w:tr>
+      <w:tr>
+        <w:trPr/>
+        <w:tc>
+          <w:p>
+            <w:r>
+              <w:t xml:space="preserve">Missing required argument for --add</w:t>
+            </w:r>
+          </w:p>
+        </w:tc>
+        <w:tc>
+          <w:p>
+            <w:r>
+              <w:t xml:space="preserve">SN_PROD_INSTANCE secret is empty</w:t>
+            </w:r>
+          </w:p>
+        </w:tc>
+        <w:tc>
+          <w:p>
+            <w:r>
+              <w:t xml:space="preserve">Check secrets are in the production environment (not Prod or PROD — must be exact lowercase)</w:t>
+            </w:r>
+          </w:p>
+        </w:tc>
+      </w:tr>
+      <w:tr>
+        <w:trPr/>
+        <w:tc>
+          <w:p>
+            <w:r>
+              <w:t xml:space="preserve">Deploy &gt; PROD Instance skipped</w:t>
+            </w:r>
+          </w:p>
+        </w:tc>
+        <w:tc>
+          <w:p>
+            <w:r>
+              <w:t xml:space="preserve">Workflow triggered by nowdev push, not prod</w:t>
+            </w:r>
+          </w:p>
+        </w:tc>
+        <w:tc>
+          <w:p>
+            <w:r>
+              <w:t xml:space="preserve">Push to prod branch. The prod job only runs when github.ref is refs/heads/prod</w:t>
+            </w:r>
+          </w:p>
+        </w:tc>
+      </w:tr>
+      <w:tr>
+        <w:trPr/>
+        <w:tc>
+          <w:p>
+            <w:r>
+              <w:t xml:space="preserve">Job shows Waiting for review</w:t>
+            </w:r>
+          </w:p>
+        </w:tc>
+        <w:tc>
+          <w:p>
+            <w:r>
+              <w:t xml:space="preserve">production environment has protection rules enabled</w:t>
+            </w:r>
+          </w:p>
+        </w:tc>
+        <w:tc>
+          <w:p>
+            <w:r>
+              <w:t xml:space="preserve">Approve the deployment in GitHub &gt; Actions &gt; the run &gt; Review deployments</w:t>
+            </w:r>
+          </w:p>
+        </w:tc>
+      </w:tr>
+      <w:tr>
+        <w:trPr/>
+        <w:tc>
+          <w:p>
+            <w:r>
+              <w:t xml:space="preserve">Re-run needed after fixing secrets</w:t>
+            </w:r>
+          </w:p>
+        </w:tc>
+        <w:tc>
+          <w:p>
+            <w:r>
+              <w:t xml:space="preserve">Secrets were missing when the job originally ran</w:t>
+            </w:r>
+          </w:p>
+        </w:tc>
+        <w:tc>
+          <w:p>
+            <w:r>
+              <w:t xml:space="preserve">GitHub &gt; Actions &gt; failed run &gt; Re-run failed jobs</w:t>
+            </w:r>
+          </w:p>
+        </w:tc>
+      </w:tr>
+    </w:tbl>
     <w:sectPr>
       <w:pgSz w:w="11906" w:h="16838"/>
       <w:pgMar w:top="1440" w:right="1800" w:bottom="1440" w:left="1800" w:header="720" w:footer="720" w:gutter="0"/>
@@ -3586,6 +3876,90 @@
     </w:lvl>
   </w:abstractNum>
   <w:abstractNum w:abstractNumId="9">
+    <w:multiLevelType w:val="hybridMultilevel"/>
+    <w:lvl w:ilvl="0">
+      <w:start w:val="1"/>
+      <w:numFmt w:val="bullet"/>
+      <w:lvlText w:val="•"/>
+      <w:lvlJc w:val="left"/>
+      <w:pPr>
+        <w:ind w:left="720" w:hanging="360"/>
+      </w:pPr>
+    </w:lvl>
+    <w:lvl w:ilvl="1">
+      <w:start w:val="1"/>
+      <w:numFmt w:val="bullet"/>
+      <w:lvlText w:val="◦"/>
+      <w:lvlJc w:val="left"/>
+      <w:pPr>
+        <w:ind w:left="1440" w:hanging="360"/>
+      </w:pPr>
+    </w:lvl>
+    <w:lvl w:ilvl="2">
+      <w:start w:val="1"/>
+      <w:numFmt w:val="bullet"/>
+      <w:lvlText w:val="▪"/>
+      <w:lvlJc w:val="left"/>
+      <w:pPr>
+        <w:ind w:left="2160" w:hanging="360"/>
+      </w:pPr>
+    </w:lvl>
+    <w:lvl w:ilvl="3">
+      <w:start w:val="1"/>
+      <w:numFmt w:val="bullet"/>
+      <w:lvlText w:val="•"/>
+      <w:lvlJc w:val="left"/>
+      <w:pPr>
+        <w:ind w:left="2880" w:hanging="360"/>
+      </w:pPr>
+    </w:lvl>
+    <w:lvl w:ilvl="4">
+      <w:start w:val="1"/>
+      <w:numFmt w:val="bullet"/>
+      <w:lvlText w:val="◦"/>
+      <w:lvlJc w:val="left"/>
+      <w:pPr>
+        <w:ind w:left="3600" w:hanging="360"/>
+      </w:pPr>
+    </w:lvl>
+    <w:lvl w:ilvl="5">
+      <w:start w:val="1"/>
+      <w:numFmt w:val="bullet"/>
+      <w:lvlText w:val="▪"/>
+      <w:lvlJc w:val="left"/>
+      <w:pPr>
+        <w:ind w:left="4320" w:hanging="360"/>
+      </w:pPr>
+    </w:lvl>
+    <w:lvl w:ilvl="6">
+      <w:start w:val="1"/>
+      <w:numFmt w:val="bullet"/>
+      <w:lvlText w:val="•"/>
+      <w:lvlJc w:val="left"/>
+      <w:pPr>
+        <w:ind w:left="5040" w:hanging="360"/>
+      </w:pPr>
+    </w:lvl>
+    <w:lvl w:ilvl="7">
+      <w:start w:val="1"/>
+      <w:numFmt w:val="bullet"/>
+      <w:lvlText w:val="◦"/>
+      <w:lvlJc w:val="left"/>
+      <w:pPr>
+        <w:ind w:left="5760" w:hanging="360"/>
+      </w:pPr>
+    </w:lvl>
+    <w:lvl w:ilvl="8">
+      <w:start w:val="1"/>
+      <w:numFmt w:val="bullet"/>
+      <w:lvlText w:val="▪"/>
+      <w:lvlJc w:val="left"/>
+      <w:pPr>
+        <w:ind w:left="6480" w:hanging="360"/>
+      </w:pPr>
+    </w:lvl>
+  </w:abstractNum>
+  <w:abstractNum w:abstractNumId="10">
     <w:multiLevelType w:val="hybridMultilevel"/>
     <w:lvl w:ilvl="0">
       <w:start w:val="1"/>
@@ -3698,6 +4072,9 @@
   </w:num>
   <w:num w:numId="10">
     <w:abstractNumId w:val="9"/>
+  </w:num>
+  <w:num w:numId="11">
+    <w:abstractNumId w:val="10"/>
   </w:num>
 </w:numbering>
 </file>

</xml_diff>

<commit_message>
docs: add ProdFlowExecution + ProdJevRequestAndResponse screenshots, update SETUP.md and docx PoC + Code Promotion sections
</commit_message>
<xml_diff>
--- a/docs/JevNowIntegration.docx
+++ b/docs/JevNowIntegration.docx
@@ -1882,6 +1882,44 @@
     <w:p>
       <w:r>
         <w:t>Test run: Incident INC0010048 (Office Wi-Fi intermittent in meeting rooms B4 and B5). Impact: 2-Medium, Urgency: 2-Medium, no business service assigned in SN.</w:t>
+      </w:r>
+    </w:p>
+    <w:p>
+      <w:pPr>
+        <w:pStyle w:val="Normal"/>
+        <w:spacing w:after="160"/>
+      </w:pPr>
+      <w:r>
+        <w:rPr/>
+        <w:t xml:space="preserve">The PROD Jev Request record shows state Processed, u_result_summary populated with the structured answer map, and no errors — confirming the connection alias, credential, and flow all function correctly in the production instance. See docs/images/ProdJevRequestAndResponse.png.</w:t>
+      </w:r>
+    </w:p>
+    <w:p>
+      <w:pPr>
+        <w:pStyle w:val="Heading2"/>
+      </w:pPr>
+      <w:r>
+        <w:rPr/>
+        <w:t xml:space="preserve">8.2 PROD Verification — Jev Request Result</w:t>
+      </w:r>
+    </w:p>
+    <w:p>
+      <w:pPr>
+        <w:pStyle w:val="Normal"/>
+        <w:spacing w:after="160"/>
+      </w:pPr>
+      <w:r>
+        <w:rPr/>
+        <w:t xml:space="preserve">After promoting to PROD, the TriggerJevIntegration flow was confirmed working in the production instance. All steps completed successfully — the REST call to BeatAPI returned 200 OK and the Jev answers were written back to the request record. See docs/images/ProdFlowExecution.png.</w:t>
+      </w:r>
+    </w:p>
+    <w:p>
+      <w:pPr>
+        <w:pStyle w:val="Heading2"/>
+      </w:pPr>
+      <w:r>
+        <w:rPr/>
+        <w:t xml:space="preserve">8.1 PROD Verification — Flow Execution</w:t>
       </w:r>
     </w:p>
     <w:p>
@@ -2946,7 +2984,7 @@
       <w:pPr/>
       <w:r>
         <w:rPr/>
-        <w:t xml:space="preserve">The JevBeatAPI connection alias shell is deployed automatically but the credential and connection URL must be set manually: (1) Connections and Credentials &gt; Connection and Credential Aliases &gt; JevBeatAPI. (2) Credentials tab &gt; New &gt; HTTP Header &gt; Authorization &gt; Bearer sk-xxxx (API key from https://console.typesafe.ai). (3) Connections tab &gt; New &gt; Connection URL: https://api.beatapi.io/v1/systemone &gt; select credential above. (4) Save.</w:t>
+        <w:t xml:space="preserve">The JevBeatAPIConnection alias shell is deployed automatically by the app. The credential and connection URL must be set manually per instance. Option A (XML import — fastest): (1) System Update Sets &gt; Import XML. (2) Import in order: sys_alias_ec27b76c83fb0b10b96f6ed0deaad3f5.xml, then api_key_credentials_5e2b629883fb4710b96f6ed0deaad32f.xml, then http_connection_c71773ec83fb0b10b96f6ed0deaad329.xml (all in docs/sn-exports/). (3) Open Connections &amp; Credentials &gt; Credentials &gt; JevBeatAPI and set API key to Bearer sk-xxxxxxxxxxxxxxxxxxxxxxxx (from https://console.typesafe.ai). Option B (manual): see Section 7. Once deployed, verify end-to-end: docs/images/ProdDeployment.png shows the GitHub Actions PROD deploy succeeded; docs/images/ProdFlowExecution.png shows the flow ran in PROD; docs/images/ProdJevRequestAndResponse.png shows the processed Jev Request result in PROD.</w:t>
       </w:r>
     </w:p>
     <w:p>

</xml_diff>